<commit_message>
Make TikTok script generator reusable via JSON input for daily automation
Co-Authored-By: Claude Opus 4.8 <noreply@anthropic.com>
Claude-Session: https://claude.ai/code/session_01TWkMByCcoLQSn7Uwz2as7B
</commit_message>
<xml_diff>
--- a/docs/scripts/2026-06-27-explain-your-complex-job-simply-using-chatgpt.docx
+++ b/docs/scripts/2026-06-27-explain-your-complex-job-simply-using-chatgpt.docx
@@ -62,7 +62,7 @@
         <w:t xml:space="preserve">Why this one: </w:t>
       </w:r>
       <w:r>
-        <w:t>Easiest one on the site, funny, relatable, works on your phone, no spend.</w:t>
+        <w:t>Easiest, funniest, most relatable on the site.</w:t>
       </w:r>
     </w:p>
     <w:p/>
@@ -71,7 +71,7 @@
         <w:pStyle w:val="Heading2"/>
       </w:pPr>
       <w:r>
-        <w:t>🎬 Read this on camera (~75 sec)</w:t>
+        <w:t>Read this on camera (~75 sec)</w:t>
       </w:r>
     </w:p>
     <w:p>
@@ -81,7 +81,7 @@
           <w:color w:val="990055"/>
           <w:sz w:val="24"/>
         </w:rPr>
-        <w:t>HOOK  (0–3s)</w:t>
+        <w:t>HOOK  (0-3s)</w:t>
       </w:r>
     </w:p>
     <w:p>
@@ -90,7 +90,7 @@
           <w:i/>
           <w:color w:val="666666"/>
         </w:rPr>
-        <w:t>[On-screen text: "Your mum STILL doesn't know what you do 😭"]</w:t>
+        <w:t>[On-screen text: Your mum STILL doesn't know what you do]</w:t>
       </w:r>
     </w:p>
     <w:p>
@@ -109,7 +109,7 @@
           <w:color w:val="990055"/>
           <w:sz w:val="24"/>
         </w:rPr>
-        <w:t>OPEN  (3–8s)</w:t>
+        <w:t>THE PROMPT  (8-35s)</w:t>
       </w:r>
     </w:p>
     <w:p>
@@ -118,35 +118,7 @@
           <w:i/>
           <w:color w:val="666666"/>
         </w:rPr>
-        <w:t>[Open ChatGPT on your phone, start screen-recording here.]</w:t>
-      </w:r>
-    </w:p>
-    <w:p>
-      <w:pPr>
-        <w:ind w:left="360"/>
-      </w:pPr>
-      <w:r>
-        <w:t>“Open chatgpt.com — totally free — and start a new chat.”</w:t>
-      </w:r>
-    </w:p>
-    <w:p/>
-    <w:p>
-      <w:r>
-        <w:rPr>
-          <w:b/>
-          <w:color w:val="990055"/>
-          <w:sz w:val="24"/>
-        </w:rPr>
-        <w:t>THE PROMPT  (8–35s)</w:t>
-      </w:r>
-    </w:p>
-    <w:p>
-      <w:r>
-        <w:rPr>
-          <w:i/>
-          <w:color w:val="666666"/>
-        </w:rPr>
-        <w:t>[SHOW THE PROMPT BIG on screen.]</w:t>
+        <w:t>[Show the prompt big on screen]</w:t>
       </w:r>
     </w:p>
     <w:p>
@@ -165,6 +137,7 @@
         <w:rPr>
           <w:rFonts w:ascii="Consolas" w:hAnsi="Consolas"/>
           <w:b/>
+          <w:color w:val="990055"/>
         </w:rPr>
         <w:t>Explain what a [your job title] does, but make it simple enough for a 5-year-old to understand.</w:t>
       </w:r>
@@ -177,7 +150,7 @@
           <w:color w:val="990055"/>
           <w:sz w:val="24"/>
         </w:rPr>
-        <w:t>REACT  (35–55s)</w:t>
+        <w:t>CTA  (70-75s)</w:t>
       </w:r>
     </w:p>
     <w:p>
@@ -186,7 +159,7 @@
           <w:i/>
           <w:color w:val="666666"/>
         </w:rPr>
-        <w:t>[Read the AI's answer out loud and react.]</w:t>
+        <w:t>[On-screen text: opqai.solutions, link in bio]</w:t>
       </w:r>
     </w:p>
     <w:p>
@@ -194,63 +167,7 @@
         <w:ind w:left="360"/>
       </w:pPr>
       <w:r>
-        <w:t>“And look — it says I basically 'count toys and make colourful pictures.' That's... actually accurate 😂”</w:t>
-      </w:r>
-    </w:p>
-    <w:p/>
-    <w:p>
-      <w:r>
-        <w:rPr>
-          <w:b/>
-          <w:color w:val="990055"/>
-          <w:sz w:val="24"/>
-        </w:rPr>
-        <w:t>PAYOFF  (55–70s)</w:t>
-      </w:r>
-    </w:p>
-    <w:p>
-      <w:r>
-        <w:rPr>
-          <w:i/>
-          <w:color w:val="666666"/>
-        </w:rPr>
-        <w:t>[Show you can refine it.]</w:t>
-      </w:r>
-    </w:p>
-    <w:p>
-      <w:pPr>
-        <w:ind w:left="360"/>
-      </w:pPr>
-      <w:r>
-        <w:t>“Want it simpler or funnier? Just say 'make it even simpler' and it redoes it instantly.”</w:t>
-      </w:r>
-    </w:p>
-    <w:p/>
-    <w:p>
-      <w:r>
-        <w:rPr>
-          <w:b/>
-          <w:color w:val="990055"/>
-          <w:sz w:val="24"/>
-        </w:rPr>
-        <w:t>CTA  (70–75s)</w:t>
-      </w:r>
-    </w:p>
-    <w:p>
-      <w:r>
-        <w:rPr>
-          <w:i/>
-          <w:color w:val="666666"/>
-        </w:rPr>
-        <w:t>[On-screen text: "opqai.solutions — link in bio"]</w:t>
-      </w:r>
-    </w:p>
-    <w:p>
-      <w:pPr>
-        <w:ind w:left="360"/>
-      </w:pPr>
-      <w:r>
-        <w:t>“Full steps and the exact prompt are free on opqai.solutions — new AI trick every day. Link in bio.”</w:t>
+        <w:t>“Full steps and the exact prompt are free on opqai.solutions. Link in bio.”</w:t>
       </w:r>
     </w:p>
     <w:p/>
@@ -259,17 +176,17 @@
         <w:pStyle w:val="Heading2"/>
       </w:pPr>
       <w:r>
-        <w:t>📝 Caption</w:t>
+        <w:t>Caption</w:t>
       </w:r>
     </w:p>
     <w:p>
       <w:r>
-        <w:t>Make AI explain your job like you're 5 😭 Free prompt, link in bio 👇</w:t>
+        <w:t>Make AI explain your job like you're 5. Free prompt, link in bio.</w:t>
       </w:r>
     </w:p>
     <w:p>
       <w:r>
-        <w:t>#ai #chatgpt #howto #naijatech #techtok #productivity</w:t>
+        <w:t>#ai #chatgpt #howto #naijatech #techtok</w:t>
       </w:r>
     </w:p>
     <w:p/>
@@ -279,7 +196,7 @@
           <w:i/>
           <w:color w:val="666666"/>
         </w:rPr>
-        <w:t>After posting: paste the TikTok link into this workflow's tiktokUrl and log it.</w:t>
+        <w:t>After posting: paste the TikTok link into this workflow's tiktokUrl and add a row to docs/posting-log.md.</w:t>
       </w:r>
     </w:p>
     <w:sectPr>

</xml_diff>